<commit_message>
feat: multi-factory template registry + configurable report templates
- New template registry (core/template/registry.ts) with TemplateMeta/StyleConfig types
- Support multiple Word templates per factory (font/size/indent/spacing configurable)
- Built-in 'default' (Arial+宋体, 五号) and 'factory-a' (Times New Roman+宋体, 小四) presets
- Settings page new '报告模板' tab for template selection
- Filler now reads SELECTED_TEMPLATE from DB and routes to correct template
- Backward compatible: no SELECTED_TEMPLATE setting → uses default
- IPC: template:getAllWordTemplates handler for UI listing
- Full design doc: docs/multi-factory-template-design.md
</commit_message>
<xml_diff>
--- a/dev-output/e2e-report.docx
+++ b/dev-output/e2e-report.docx
@@ -1683,7 +1683,7 @@
         <w:rPr>
           <w:rFonts w:ascii="Arial" w:hAnsi="Arial" w:cs="Arial"/>
         </w:rPr>
-        <w:t xml:space="preserve">发生偏差后，生产部门操作员李明立即上报生产主管并通知分管QA，QA组织和协调偏差涉及相关部门对偏差进行根源调查，调查过程如下：</w:t>
+        <w:t/>
       </w:r>
     </w:p>
     <w:p>
@@ -1737,7 +1737,7 @@
           <w:rFonts w:ascii="Arial" w:hAnsi="Arial" w:cs="Arial"/>
           <w:b/>
         </w:rPr>
-        <w:t xml:space="preserve">初步分析 Preliminary Analysis</w:t>
+        <w:t/>
       </w:r>
     </w:p>
     <w:p>
@@ -1754,7 +1754,7 @@
           <w:sz w:val="21" w:szCs="21"/>
           <w:lang w:eastAsia="zh-CN"/>
         </w:rPr>
-        <w:t xml:space="preserve">压片机中模磨损导致片重差异 / 检查发现中模磨损超过规定限度，与初步排查结果一致。 / 物料粒度分布偏宽导致片重差异 / 检查发现物料粒度分布确实偏宽，超出工艺要求范围。</w:t>
+        <w:t/>
       </w:r>
     </w:p>
     <w:p>
@@ -1845,7 +1845,7 @@
           <w:sz w:val="21" w:szCs="21"/>
           <w:lang w:eastAsia="zh-CN"/>
         </w:rPr>
-        <w:t xml:space="preserve">操作员李明，经查阅培训记录，其接受了H0-TM-23113《压片机操作规程》培训，但培训内容未涵盖物料粒度分布的控制要求。操作员在发现设备异常时未能及时报告，且对设备异常的识别能力不足，未按标准操作程序（SOP）进行设备检查。排除操作员责任心问题，但确认操作员培训不足。设备</w:t>
+        <w:t xml:space="preserve">待补充设备</w:t>
       </w:r>
     </w:p>
     <w:p>
@@ -1862,7 +1862,7 @@
           <w:sz w:val="21" w:szCs="21"/>
           <w:lang w:eastAsia="zh-CN"/>
         </w:rPr>
-        <w:t xml:space="preserve">3号压片机中模磨损超过规定限度，经拆卸检查确认中模磨损严重，影响片重控制。压片机的片重控制系统经检查未发现故障，但维护保养记录不完整，未能提供最近一次的校验记录。压片机的清洁和消毒程序未严格执行，存在潜在污染风险。详见调查报告-附件1方法</w:t>
+        <w:t xml:space="preserve">待补充方法</w:t>
       </w:r>
     </w:p>
     <w:p>
@@ -1879,7 +1879,7 @@
           <w:sz w:val="21" w:szCs="21"/>
           <w:lang w:eastAsia="zh-CN"/>
         </w:rPr>
-        <w:t xml:space="preserve">现行规程H0-TM-23113缺乏针对物料粒度分布的控制要求，且片重控制工艺参数设置不当。生产过程中的物料添加速度不一致，压片机的运行参数未定期校验，生产过程中未进行中间控制检查。详见调查报告-附件3物料</w:t>
+        <w:t xml:space="preserve">待补充物料</w:t>
       </w:r>
     </w:p>
     <w:p>
@@ -1896,7 +1896,7 @@
           <w:sz w:val="21" w:szCs="21"/>
           <w:lang w:eastAsia="zh-CN"/>
         </w:rPr>
-        <w:t xml:space="preserve">物料粒度分布偏宽，超出工艺要求范围。经检查确认物料供应商提供的物料质量不稳定，且物料存储条件不当，导致物料性质变化。物料混合不均匀，进一步加剧了片重差异。详见调查报告-附件2环境</w:t>
+        <w:t xml:space="preserve">待补充环境</w:t>
       </w:r>
     </w:p>
     <w:p>
@@ -1913,7 +1913,7 @@
           <w:sz w:val="21" w:szCs="21"/>
           <w:lang w:eastAsia="zh-CN"/>
         </w:rPr>
-        <w:t xml:space="preserve">生产车间温湿度控制不当，影响物料流动性。生产车间的清洁度不符合要求，可能引入异物。生产车间的振动或噪音影响设备运行稳定性。生产车间的照明不足，影响操作员的视觉判断。排除环境因素造成偏差的可能性，无影响。测量</w:t>
+        <w:t xml:space="preserve">待补充测量</w:t>
       </w:r>
     </w:p>
     <w:p>
@@ -1930,7 +1930,7 @@
           <w:sz w:val="21" w:szCs="21"/>
           <w:lang w:eastAsia="zh-CN"/>
         </w:rPr>
-        <w:t xml:space="preserve">片重测量设备的校准状态过期，经检查发现校准记录缺失。片重测量设备的精度不符合要求，片重测量探头或仪表损坏未及时更换。详见调查报告-附件4</w:t>
+        <w:t xml:space="preserve">待补充</w:t>
       </w:r>
     </w:p>
     <w:p>
@@ -1945,7 +1945,7 @@
         <w:rPr>
           <w:rFonts w:ascii="Arial" w:hAnsi="Arial" w:cs="Arial"/>
         </w:rPr>
-        <w:t xml:space="preserve">经全面调查，本次偏差的根本原因为：操作员培训不足，压片机中模磨损超过规定限度，物料粒度分布偏宽，片重测量设备的校准状态过期。属于人员、设备、物料和测量原因。</w:t>
+        <w:t xml:space="preserve">基于现有信息初步判断，相关因素包括：操作员未按照标准操作程序进行设备检查、操作员对设备异常的识别能力不足、操作员未及时报告设备异常情况、操作员培训不足，对物料粒度分布的影响认识不足、压片机中模磨损超过规定限度、压片机的维护保养计划执行不到位、压片机的清洁程序未严格执行、压片机的控制系统故障，导致片重控制不准确、物料粒度分布偏宽，超出工艺要求范围、物料供应商提供的物料质量不稳定、物料存储条件不当，导致物料性质变化、物料混合不均匀，影响片重一致性、生产工艺参数设置不当，如压力、速度等、生产过程中的监控频率不足，未能及时发现片重差异、生产前的物料预处理步骤执行不严格、生产过程中的调整和校正措施不及时、生产车间温湿度控制不当，影响物料性质、生产车间清洁度不符合要求，可能引入杂质、生产车间的振动或噪音影响设备运行稳定性、生产车间的气流影响物料的均匀分布、片重检测设备的校准状态不符合要求、片重检测设备的校准记录缺失或不完整、片重检测设备的探头或传感器损坏、片重检测设备的操作方法不正确。具体根本原因待补充调查后确认。</w:t>
       </w:r>
     </w:p>
     <w:p>
@@ -2294,7 +2294,7 @@
           <w:szCs w:val="21"/>
           <w:lang w:eastAsia="zh-CN"/>
         </w:rPr>
-        <w:t xml:space="preserve">查看生产部近2年无类似现象的偏差。无类似偏差。</w:t>
+        <w:t xml:space="preserve">待补充待补充</w:t>
       </w:r>
     </w:p>
     <w:p>
@@ -2571,7 +2571,7 @@
         <w:rPr>
           <w:rFonts w:ascii="Arial" w:hAnsi="Arial" w:cs="Arial"/>
         </w:rPr>
-        <w:t xml:space="preserve">本次偏差发生于3号压片机生产阶段，仅涉及批号26082601，未涉及其他产品或批次。不涉及其他产品或批次。</w:t>
+        <w:t xml:space="preserve">待补充待补充</w:t>
       </w:r>
     </w:p>
     <w:p>
@@ -2615,7 +2615,7 @@
           <w:szCs w:val="21"/>
           <w:lang w:eastAsia="zh-CN"/>
         </w:rPr>
-        <w:t xml:space="preserve">操作员培训不足，压片机中模磨损超过规定限度，物料粒度分布偏宽，片重测量设备的校准状态过期。属于人员、设备、物料和测量原因。</w:t>
+        <w:t xml:space="preserve">操作员未按照标准操作程序进行设备检查, 操作员对设备异常的识别能力不足, 操作员未及时报告设备异常情况, 操作员培训不足, 压片机中模磨损超过规定限度, 压片机的维护保养计划执行不到位, 物料粒度分布偏宽, 超出工艺要求范围, 物料供应商提供的物料质量不稳定, 生产工艺参数设置不当, 如压力、速度等, 生产过程中的监控频率不足, 未能及时发现片重差异, 生产前的物料预处理步骤执行不严格, 生产车间温湿度控制不当, 影响物料性质, 片重检测设备的校准状态不符合要求, 片重检测设备的探头或传感器损坏</w:t>
       </w:r>
     </w:p>
     <w:p>
@@ -2664,7 +2664,7 @@
           <w:sz w:val="21" w:szCs="21"/>
           <w:lang w:eastAsia="zh-CN"/>
         </w:rPr>
-        <w:t xml:space="preserve">本次偏差调查针对3号压片机出现的片重差异超限问题进行了全面分析。调查发现，操作员未按标准操作程序（SOP）进行设备检查，且对设备异常的识别能力不足，未能及时报告设备异常情况。此外，操作员培训不足，对物料粒度分布的控制要求不熟悉，导致物料粒度分布偏宽，超出工艺要求范围。压片机中模磨损超过规定限度，片重控制系统故障，维护保养记录不完整，清洁和消毒程序未严格执行，这些设备问题进一步加剧了片重差异。物料供应商提供的物料质量不稳定，物料存储条件不当导致物料性质变化，物料混合不均匀，这些物料问题也对片重差异产生了影响。生产过程中的物料添加速度不一致，压片机的运行参数未定期校验，未进行中间控制检查，这些工艺参数设置不当的问题，同样对片重控制造成了不利影响。生产车间温湿度控制不当，影响物料流动性；清洁度不符合要求，可能引入异物；振动或噪音影响设备运行稳定性；照明不足，影响操作员的视觉判断，这些环境因素也对生产过程产生了负面影响。片重测量设备的校准状态过期，校准记录缺失，精度不符合要求，探头或仪表损坏未及时更换，这些问题直接影响了片重测量的准确性。\n\n在产品质量方面，片重差异超限可能影响产品的均匀性和剂量准确性，属于中等风险。在稳定性方面，由于片重差异可能导致产品在储存和运输过程中的性能变化，同样属于中等风险。在上市许可/注册文件方面，片重差异超限可能需要重新评估产品的质量标准，以确保符合法规要求，属于中等风险。在客户方面，产品质量问题可能导致客户投诉或退货，影响客户信任，属于中等风险。在验证有效性方面，片重测量设备的校准状态过期直接影响了验证结果的可靠性，属于高风险。\n\n针对上述问题，建议立即对操作员进行培训，确保其熟悉SOP和物料控制要求；对压片机进行全面检查和维护，更换磨损的中模，确保设备正常运行；与物料供应商沟通，确保物料质量稳定，改善物料存储条件，确保物料性质不变；优化生产过程中的工艺参数设置，确保物料添加速度一致，定期校验压片机的运行参数，进行中间控制检查；改善生产车间的环境条件，确保温湿度、清洁度、振动和噪音符合要求；及时校准片重测量设备，确保其精度和可靠性。小结：1）产品质量和稳定性存在中等风险；2）上市许可/注册文件需重新评估以确保符合法规要求；3）客户信任度可能受到影响，存在中等风险；4）验证有效性受到高风险影响，需立即采取措施确保设备校准状态。</w:t>
+        <w:t xml:space="preserve">本次偏差涉及3号压片机在生产过程中出现的片重差异超限问题，部分片剂超出目标片重±5%范围。根据初步调查，操作员未按照标准操作程序进行设备检查，且对设备异常的识别能力不足，未能及时报告设备异常情况。此外，操作员培训不足，对物料粒度分布的影响认识不足，导致物料粒度分布偏宽，超出工艺要求范围。压片机中模磨损超过规定限度，维护保养计划执行不到位，清洁程序未严格执行，控制系统故障导致片重控制不准确。物料供应商提供的物料质量不稳定，物料存储条件不当导致物料性质变化，物料混合不均匀影响片重一致性。生产工艺参数设置不当，如压力、速度等，生产过程中的监控频率不足，未能及时发现片重差异，生产前的物料预处理步骤执行不严格，生产过程中的调整和校正措施不及时。生产车间温湿度控制不当，影响物料性质；清洁度不符合要求，可能引入杂质；振动或噪音影响设备运行稳定性；气流影响物料的均匀分布。片重检测设备的校准状态不符合要求，校准记录缺失或不完整，探头或传感器损坏，操作方法不正确。这些因素可能对产品质量和稳定性产生中等至高的风险。对于上市许可/注册文件，由于片重是关键质量属性之一，偏差可能导致文件中的质量数据不再准确，影响文件的有效性。客户方面，片重差异超限可能影响产品的疗效和安全性，导致客户投诉或退货，影响客户信任。验证有效性方面，片重检测设备的校准状态不符合要求，校准记录缺失或不完整，探头或传感器损坏，操作方法不正确，这些都可能影响验证结果的准确性，进而影响验证的有效性。小结：1）产品质量和稳定性存在中等至高风险；2）上市许可/注册文件的有效性可能受到影响；3）客户信任度可能下降，存在投诉或退货风险；4）验证有效性存在中等风险。</w:t>
       </w:r>
     </w:p>
     <w:p>
@@ -2885,7 +2885,7 @@
               <w:rPr>
                 <w:rFonts w:ascii="Arial" w:hAnsi="Arial" w:cs="Arial"/>
               </w:rPr>
-              <w:t xml:space="preserve">CP-TZ-API-DEV-MT9LWHEN-MYD3-26001</w:t>
+              <w:t xml:space="preserve">CP-TZ-API-DEV-MTAVG53N-NNZG-26001</w:t>
             </w:r>
           </w:p>
         </w:tc>
@@ -2904,7 +2904,7 @@
               <w:rPr>
                 <w:rFonts w:ascii="Arial" w:hAnsi="Arial" w:cs="Arial"/>
               </w:rPr>
-              <w:t xml:space="preserve">更换3号压片机的中模，确保其磨损度在规定限度内。</w:t>
+              <w:t xml:space="preserve">对3号压片机进行彻底检查，更换磨损超过规定限度的中模，并修复控制系统故障，确保片重控制准确。已完成 2026.08.28</w:t>
             </w:r>
           </w:p>
         </w:tc>
@@ -2923,7 +2923,7 @@
               <w:rPr>
                 <w:rFonts w:ascii="Arial" w:hAnsi="Arial" w:cs="Arial"/>
               </w:rPr>
-              <w:t xml:space="preserve">设备维护主管</w:t>
+              <w:t xml:space="preserve">设备维护部张工</w:t>
             </w:r>
           </w:p>
         </w:tc>
@@ -2943,7 +2943,7 @@
               <w:rPr>
                 <w:rFonts w:ascii="Arial" w:hAnsi="Arial" w:cs="Arial"/>
               </w:rPr>
-              <w:t xml:space="preserve">2026.09.10</w:t>
+              <w:t xml:space="preserve">2026.08.28</w:t>
             </w:r>
           </w:p>
         </w:tc>
@@ -2988,7 +2988,7 @@
               <w:rPr>
                 <w:rFonts w:ascii="Arial" w:hAnsi="Arial" w:cs="Arial"/>
               </w:rPr>
-              <w:t xml:space="preserve">CP-TZ-API-DEV-MT9LWHEN-MYD3-26002</w:t>
+              <w:t xml:space="preserve">CP-TZ-API-DEV-MTAVG53N-NNZG-26002</w:t>
             </w:r>
           </w:p>
         </w:tc>
@@ -3007,7 +3007,7 @@
               <w:rPr>
                 <w:rFonts w:ascii="Arial" w:hAnsi="Arial" w:cs="Arial"/>
               </w:rPr>
-              <w:t xml:space="preserve">对批号26082601的物料进行重新筛选，确保粒度分布符合工艺要求。</w:t>
+              <w:t xml:space="preserve">对批号26082601的物料进行重新评估，确保物料粒度分布符合工艺要求。已完成 2026.08.27</w:t>
             </w:r>
           </w:p>
         </w:tc>
@@ -3026,7 +3026,7 @@
               <w:rPr>
                 <w:rFonts w:ascii="Arial" w:hAnsi="Arial" w:cs="Arial"/>
               </w:rPr>
-              <w:t xml:space="preserve">生产主管</w:t>
+              <w:t xml:space="preserve">质量控制部李工</w:t>
             </w:r>
           </w:p>
         </w:tc>
@@ -3046,7 +3046,7 @@
               <w:rPr>
                 <w:rFonts w:ascii="Arial" w:hAnsi="Arial" w:cs="Arial"/>
               </w:rPr>
-              <w:t xml:space="preserve">2026.09.05</w:t>
+              <w:t xml:space="preserve">2026.08.27</w:t>
             </w:r>
           </w:p>
         </w:tc>
@@ -3091,7 +3091,7 @@
               <w:rPr>
                 <w:rFonts w:ascii="Arial" w:hAnsi="Arial" w:cs="Arial"/>
               </w:rPr>
-              <w:t xml:space="preserve">CP-TZ-API-DEV-MT9LWHEN-MYD3-26003</w:t>
+              <w:t xml:space="preserve">CP-TZ-API-DEV-MTAVG53N-NNZG-26003</w:t>
             </w:r>
           </w:p>
         </w:tc>
@@ -3110,7 +3110,7 @@
               <w:rPr>
                 <w:rFonts w:ascii="Arial" w:hAnsi="Arial" w:cs="Arial"/>
               </w:rPr>
-              <w:t xml:space="preserve">校准片重测量设备，确保其精度符合要求。</w:t>
+              <w:t xml:space="preserve">对片重检测设备进行校准，更换损坏的探头或传感器，确保设备正常运行。已完成 2026.08.27</w:t>
             </w:r>
           </w:p>
         </w:tc>
@@ -3129,7 +3129,7 @@
               <w:rPr>
                 <w:rFonts w:ascii="Arial" w:hAnsi="Arial" w:cs="Arial"/>
               </w:rPr>
-              <w:t xml:space="preserve">质量保证主管</w:t>
+              <w:t xml:space="preserve">设备维护部王工</w:t>
             </w:r>
           </w:p>
         </w:tc>
@@ -3149,7 +3149,7 @@
               <w:rPr>
                 <w:rFonts w:ascii="Arial" w:hAnsi="Arial" w:cs="Arial"/>
               </w:rPr>
-              <w:t xml:space="preserve">2026.09.01</w:t>
+              <w:t xml:space="preserve">2026.08.27</w:t>
             </w:r>
           </w:p>
         </w:tc>
@@ -3330,7 +3330,7 @@
               <w:rPr>
                 <w:rFonts w:ascii="Arial" w:hAnsi="Arial" w:cs="Arial"/>
               </w:rPr>
-              <w:t xml:space="preserve">CP-TZ-API-DEV-MT9LWHEN-MYD3-26004</w:t>
+              <w:t xml:space="preserve">CP-TZ-API-DEV-MTAVG53N-NNZG-26004</w:t>
             </w:r>
           </w:p>
         </w:tc>
@@ -3349,7 +3349,7 @@
               <w:rPr>
                 <w:rFonts w:ascii="Arial" w:hAnsi="Arial" w:cs="Arial"/>
               </w:rPr>
-              <w:t xml:space="preserve">完成H0-TM-23113《压片机操作规程》的升版，增加对物料粒度分布的控制要求，经审核批准后下发执行。</w:t>
+              <w:t xml:space="preserve">完成H0-TM-23113《压片机操作规程》的升版，增加对设备检查、异常识别及报告的要求，经审核批准后下发执行。预期完成日期 2026.09.15</w:t>
             </w:r>
           </w:p>
         </w:tc>
@@ -3368,7 +3368,7 @@
               <w:rPr>
                 <w:rFonts w:ascii="Arial" w:hAnsi="Arial" w:cs="Arial"/>
               </w:rPr>
-              <w:t xml:space="preserve">生产主管</w:t>
+              <w:t xml:space="preserve">生产部赵经理</w:t>
             </w:r>
           </w:p>
         </w:tc>
@@ -3388,7 +3388,7 @@
               <w:rPr>
                 <w:rFonts w:ascii="Arial" w:hAnsi="Arial" w:cs="Arial"/>
               </w:rPr>
-              <w:t xml:space="preserve">2026.10.01</w:t>
+              <w:t xml:space="preserve">2026.09.15</w:t>
             </w:r>
           </w:p>
         </w:tc>
@@ -3433,7 +3433,7 @@
               <w:rPr>
                 <w:rFonts w:ascii="Arial" w:hAnsi="Arial" w:cs="Arial"/>
               </w:rPr>
-              <w:t xml:space="preserve">CP-TZ-API-DEV-MT9LWHEN-MYD3-26005</w:t>
+              <w:t xml:space="preserve">CP-TZ-API-DEV-MTAVG53N-NNZG-26005</w:t>
             </w:r>
           </w:p>
         </w:tc>
@@ -3452,7 +3452,7 @@
               <w:rPr>
                 <w:rFonts w:ascii="Arial" w:hAnsi="Arial" w:cs="Arial"/>
               </w:rPr>
-              <w:t xml:space="preserve">制定并执行压片机中模定期检查和更换计划，确保中模磨损度始终在规定限度内。</w:t>
+              <w:t xml:space="preserve">制定并执行压片机中模定期检查和更换计划，确保中模磨损不超过规定限度。预期完成日期 2026.09.10</w:t>
             </w:r>
           </w:p>
         </w:tc>
@@ -3471,7 +3471,7 @@
               <w:rPr>
                 <w:rFonts w:ascii="Arial" w:hAnsi="Arial" w:cs="Arial"/>
               </w:rPr>
-              <w:t xml:space="preserve">设备维护主管</w:t>
+              <w:t xml:space="preserve">设备维护部张工</w:t>
             </w:r>
           </w:p>
         </w:tc>
@@ -3491,7 +3491,7 @@
               <w:rPr>
                 <w:rFonts w:ascii="Arial" w:hAnsi="Arial" w:cs="Arial"/>
               </w:rPr>
-              <w:t xml:space="preserve">2026.10.15</w:t>
+              <w:t xml:space="preserve">2026.09.10</w:t>
             </w:r>
           </w:p>
         </w:tc>
@@ -3536,7 +3536,7 @@
               <w:rPr>
                 <w:rFonts w:ascii="Arial" w:hAnsi="Arial" w:cs="Arial"/>
               </w:rPr>
-              <w:t xml:space="preserve">CP-TZ-API-DEV-MT9LWHEN-MYD3-26006</w:t>
+              <w:t xml:space="preserve">CP-TZ-API-DEV-MTAVG53N-NNZG-26006</w:t>
             </w:r>
           </w:p>
         </w:tc>
@@ -3555,7 +3555,7 @@
               <w:rPr>
                 <w:rFonts w:ascii="Arial" w:hAnsi="Arial" w:cs="Arial"/>
               </w:rPr>
-              <w:t xml:space="preserve">与物料供应商沟通，要求提供稳定质量的物料，并定期评估供应商的物料质量。</w:t>
+              <w:t xml:space="preserve">与物料供应商沟通，要求提供稳定质量的物料，并定期评估供应商的物料质量。预期完成日期 2026.09.20</w:t>
             </w:r>
           </w:p>
         </w:tc>
@@ -3574,7 +3574,7 @@
               <w:rPr>
                 <w:rFonts w:ascii="Arial" w:hAnsi="Arial" w:cs="Arial"/>
               </w:rPr>
-              <w:t xml:space="preserve">采购主管</w:t>
+              <w:t xml:space="preserve">采购部刘经理</w:t>
             </w:r>
           </w:p>
         </w:tc>
@@ -3594,7 +3594,7 @@
               <w:rPr>
                 <w:rFonts w:ascii="Arial" w:hAnsi="Arial" w:cs="Arial"/>
               </w:rPr>
-              <w:t xml:space="preserve">2026.10.30</w:t>
+              <w:t xml:space="preserve">2026.09.20</w:t>
             </w:r>
           </w:p>
         </w:tc>
@@ -3639,7 +3639,7 @@
               <w:rPr>
                 <w:rFonts w:ascii="Arial" w:hAnsi="Arial" w:cs="Arial"/>
               </w:rPr>
-              <w:t xml:space="preserve">CP-TZ-API-DEV-MT9LWHEN-MYD3-26007</w:t>
+              <w:t xml:space="preserve">CP-TZ-API-DEV-MTAVG53N-NNZG-26007</w:t>
             </w:r>
           </w:p>
         </w:tc>
@@ -3658,7 +3658,7 @@
               <w:rPr>
                 <w:rFonts w:ascii="Arial" w:hAnsi="Arial" w:cs="Arial"/>
               </w:rPr>
-              <w:t xml:space="preserve">优化物料存储条件，确保物料性质稳定，避免因存储不当导致的性质变化。</w:t>
+              <w:t xml:space="preserve">优化物料存储条件，确保物料性质稳定，避免因存储不当导致的性质变化。预期完成日期 2026.09.15</w:t>
             </w:r>
           </w:p>
         </w:tc>
@@ -3677,7 +3677,7 @@
               <w:rPr>
                 <w:rFonts w:ascii="Arial" w:hAnsi="Arial" w:cs="Arial"/>
               </w:rPr>
-              <w:t xml:space="preserve">仓储主管</w:t>
+              <w:t xml:space="preserve">仓储部陈经理</w:t>
             </w:r>
           </w:p>
         </w:tc>
@@ -3697,7 +3697,7 @@
               <w:rPr>
                 <w:rFonts w:ascii="Arial" w:hAnsi="Arial" w:cs="Arial"/>
               </w:rPr>
-              <w:t xml:space="preserve">2026.10.20</w:t>
+              <w:t xml:space="preserve">2026.09.15</w:t>
             </w:r>
           </w:p>
         </w:tc>
@@ -3742,7 +3742,7 @@
               <w:rPr>
                 <w:rFonts w:ascii="Arial" w:hAnsi="Arial" w:cs="Arial"/>
               </w:rPr>
-              <w:t xml:space="preserve">CP-TZ-API-DEV-MT9LWHEN-MYD3-26008</w:t>
+              <w:t xml:space="preserve">CP-TZ-API-DEV-MTAVG53N-NNZG-26008</w:t>
             </w:r>
           </w:p>
         </w:tc>
@@ -3761,7 +3761,7 @@
               <w:rPr>
                 <w:rFonts w:ascii="Arial" w:hAnsi="Arial" w:cs="Arial"/>
               </w:rPr>
-              <w:t xml:space="preserve">加强操作员的培训，特别是设备异常识别和报告的培训，确保所有操作员熟悉并能执行SOP。</w:t>
+              <w:t xml:space="preserve">加强物料混合过程的监控，确保物料混合均匀，提高片重一致性。预期完成日期 2026.09.10</w:t>
             </w:r>
           </w:p>
         </w:tc>
@@ -3780,7 +3780,7 @@
               <w:rPr>
                 <w:rFonts w:ascii="Arial" w:hAnsi="Arial" w:cs="Arial"/>
               </w:rPr>
-              <w:t xml:space="preserve">培训主管</w:t>
+              <w:t xml:space="preserve">生产部赵经理</w:t>
             </w:r>
           </w:p>
         </w:tc>
@@ -3800,7 +3800,7 @@
               <w:rPr>
                 <w:rFonts w:ascii="Arial" w:hAnsi="Arial" w:cs="Arial"/>
               </w:rPr>
-              <w:t xml:space="preserve">2026.09.30</w:t>
+              <w:t xml:space="preserve">2026.09.10</w:t>
             </w:r>
           </w:p>
         </w:tc>
@@ -3845,7 +3845,7 @@
               <w:rPr>
                 <w:rFonts w:ascii="Arial" w:hAnsi="Arial" w:cs="Arial"/>
               </w:rPr>
-              <w:t xml:space="preserve">CP-TZ-API-DEV-MT9LWHEN-MYD3-26009</w:t>
+              <w:t xml:space="preserve">CP-TZ-API-DEV-MTAVG53N-NNZG-26009</w:t>
             </w:r>
           </w:p>
         </w:tc>
@@ -3864,7 +3864,7 @@
               <w:rPr>
                 <w:rFonts w:ascii="Arial" w:hAnsi="Arial" w:cs="Arial"/>
               </w:rPr>
-              <w:t xml:space="preserve">建立片重测量设备定期校准计划，确保设备始终处于校准状态。</w:t>
+              <w:t xml:space="preserve">调整生产工艺参数，如压力、速度等，确保参数设置符合工艺要求。预期完成日期 2026.09.10</w:t>
             </w:r>
           </w:p>
         </w:tc>
@@ -3883,7 +3883,7 @@
               <w:rPr>
                 <w:rFonts w:ascii="Arial" w:hAnsi="Arial" w:cs="Arial"/>
               </w:rPr>
-              <w:t xml:space="preserve">质量保证主管</w:t>
+              <w:t xml:space="preserve">技术部钱工</w:t>
             </w:r>
           </w:p>
         </w:tc>
@@ -3903,7 +3903,831 @@
               <w:rPr>
                 <w:rFonts w:ascii="Arial" w:hAnsi="Arial" w:cs="Arial"/>
               </w:rPr>
-              <w:t xml:space="preserve">2026.10.01</w:t>
+              <w:t xml:space="preserve">2026.09.10</w:t>
+            </w:r>
+          </w:p>
+        </w:tc>
+        <w:tc>
+          <w:tcPr>
+            <w:tcW w:w="1097" w:type="pct"/>
+            <w:vAlign w:val="center"/>
+          </w:tcPr>
+          <w:p>
+            <w:pPr>
+              <w:jc w:val="center"/>
+              <w:rPr>
+                <w:rFonts w:ascii="Arial" w:hAnsi="Arial" w:cs="Arial"/>
+              </w:rPr>
+            </w:pPr>
+            <w:r>
+              <w:rPr>
+                <w:rFonts w:ascii="Arial" w:hAnsi="Arial" w:cs="Arial"/>
+              </w:rPr>
+              <w:t/>
+            </w:r>
+          </w:p>
+        </w:tc>
+      </w:tr>
+      <w:tr>
+        <w:trPr>
+          <w:trHeight w:hRule="exact" w:val="510"/>
+        </w:trPr>
+        <w:tc>
+          <w:tcPr>
+            <w:tcW w:w="903" w:type="pct"/>
+            <w:vAlign w:val="center"/>
+          </w:tcPr>
+          <w:p>
+            <w:pPr>
+              <w:jc w:val="center"/>
+              <w:rPr>
+                <w:rFonts w:ascii="Arial" w:hAnsi="Arial" w:cs="Arial"/>
+              </w:rPr>
+            </w:pPr>
+            <w:r>
+              <w:rPr>
+                <w:rFonts w:ascii="Arial" w:hAnsi="Arial" w:cs="Arial"/>
+              </w:rPr>
+              <w:t xml:space="preserve">CP-TZ-API-DEV-MTAVG53N-NNZG-26010</w:t>
+            </w:r>
+          </w:p>
+        </w:tc>
+        <w:tc>
+          <w:tcPr>
+            <w:tcW w:w="1393" w:type="pct"/>
+            <w:vAlign w:val="center"/>
+          </w:tcPr>
+          <w:p>
+            <w:pPr>
+              <w:rPr>
+                <w:rFonts w:ascii="Arial" w:hAnsi="Arial" w:cs="Arial"/>
+              </w:rPr>
+            </w:pPr>
+            <w:r>
+              <w:rPr>
+                <w:rFonts w:ascii="Arial" w:hAnsi="Arial" w:cs="Arial"/>
+              </w:rPr>
+              <w:t xml:space="preserve">增加生产过程中的监控频率，及时发现并处理片重差异。预期完成日期 2026.09.10</w:t>
+            </w:r>
+          </w:p>
+        </w:tc>
+        <w:tc>
+          <w:tcPr>
+            <w:tcW w:w="573" w:type="pct"/>
+            <w:vAlign w:val="center"/>
+          </w:tcPr>
+          <w:p>
+            <w:pPr>
+              <w:rPr>
+                <w:rFonts w:ascii="Arial" w:hAnsi="Arial" w:cs="Arial"/>
+              </w:rPr>
+            </w:pPr>
+            <w:r>
+              <w:rPr>
+                <w:rFonts w:ascii="Arial" w:hAnsi="Arial" w:cs="Arial"/>
+              </w:rPr>
+              <w:t xml:space="preserve">质量控制部李工</w:t>
+            </w:r>
+          </w:p>
+        </w:tc>
+        <w:tc>
+          <w:tcPr>
+            <w:tcW w:w="1034" w:type="pct"/>
+            <w:vAlign w:val="center"/>
+          </w:tcPr>
+          <w:p>
+            <w:pPr>
+              <w:jc w:val="center"/>
+              <w:rPr>
+                <w:rFonts w:ascii="Arial" w:hAnsi="Arial" w:cs="Arial"/>
+              </w:rPr>
+            </w:pPr>
+            <w:r>
+              <w:rPr>
+                <w:rFonts w:ascii="Arial" w:hAnsi="Arial" w:cs="Arial"/>
+              </w:rPr>
+              <w:t xml:space="preserve">2026.09.10</w:t>
+            </w:r>
+          </w:p>
+        </w:tc>
+        <w:tc>
+          <w:tcPr>
+            <w:tcW w:w="1097" w:type="pct"/>
+            <w:vAlign w:val="center"/>
+          </w:tcPr>
+          <w:p>
+            <w:pPr>
+              <w:jc w:val="center"/>
+              <w:rPr>
+                <w:rFonts w:ascii="Arial" w:hAnsi="Arial" w:cs="Arial"/>
+              </w:rPr>
+            </w:pPr>
+            <w:r>
+              <w:rPr>
+                <w:rFonts w:ascii="Arial" w:hAnsi="Arial" w:cs="Arial"/>
+              </w:rPr>
+              <w:t/>
+            </w:r>
+          </w:p>
+        </w:tc>
+      </w:tr>
+      <w:tr>
+        <w:trPr>
+          <w:trHeight w:hRule="exact" w:val="510"/>
+        </w:trPr>
+        <w:tc>
+          <w:tcPr>
+            <w:tcW w:w="903" w:type="pct"/>
+            <w:vAlign w:val="center"/>
+          </w:tcPr>
+          <w:p>
+            <w:pPr>
+              <w:jc w:val="center"/>
+              <w:rPr>
+                <w:rFonts w:ascii="Arial" w:hAnsi="Arial" w:cs="Arial"/>
+              </w:rPr>
+            </w:pPr>
+            <w:r>
+              <w:rPr>
+                <w:rFonts w:ascii="Arial" w:hAnsi="Arial" w:cs="Arial"/>
+              </w:rPr>
+              <w:t xml:space="preserve">CP-TZ-API-DEV-MTAVG53N-NNZG-26011</w:t>
+            </w:r>
+          </w:p>
+        </w:tc>
+        <w:tc>
+          <w:tcPr>
+            <w:tcW w:w="1393" w:type="pct"/>
+            <w:vAlign w:val="center"/>
+          </w:tcPr>
+          <w:p>
+            <w:pPr>
+              <w:rPr>
+                <w:rFonts w:ascii="Arial" w:hAnsi="Arial" w:cs="Arial"/>
+              </w:rPr>
+            </w:pPr>
+            <w:r>
+              <w:rPr>
+                <w:rFonts w:ascii="Arial" w:hAnsi="Arial" w:cs="Arial"/>
+              </w:rPr>
+              <w:t xml:space="preserve">严格执行生产前的物料预处理步骤，确保预处理步骤的规范性和有效性。预期完成日期 2026.09.15</w:t>
+            </w:r>
+          </w:p>
+        </w:tc>
+        <w:tc>
+          <w:tcPr>
+            <w:tcW w:w="573" w:type="pct"/>
+            <w:vAlign w:val="center"/>
+          </w:tcPr>
+          <w:p>
+            <w:pPr>
+              <w:rPr>
+                <w:rFonts w:ascii="Arial" w:hAnsi="Arial" w:cs="Arial"/>
+              </w:rPr>
+            </w:pPr>
+            <w:r>
+              <w:rPr>
+                <w:rFonts w:ascii="Arial" w:hAnsi="Arial" w:cs="Arial"/>
+              </w:rPr>
+              <w:t xml:space="preserve">生产部赵经理</w:t>
+            </w:r>
+          </w:p>
+        </w:tc>
+        <w:tc>
+          <w:tcPr>
+            <w:tcW w:w="1034" w:type="pct"/>
+            <w:vAlign w:val="center"/>
+          </w:tcPr>
+          <w:p>
+            <w:pPr>
+              <w:jc w:val="center"/>
+              <w:rPr>
+                <w:rFonts w:ascii="Arial" w:hAnsi="Arial" w:cs="Arial"/>
+              </w:rPr>
+            </w:pPr>
+            <w:r>
+              <w:rPr>
+                <w:rFonts w:ascii="Arial" w:hAnsi="Arial" w:cs="Arial"/>
+              </w:rPr>
+              <w:t xml:space="preserve">2026.09.15</w:t>
+            </w:r>
+          </w:p>
+        </w:tc>
+        <w:tc>
+          <w:tcPr>
+            <w:tcW w:w="1097" w:type="pct"/>
+            <w:vAlign w:val="center"/>
+          </w:tcPr>
+          <w:p>
+            <w:pPr>
+              <w:jc w:val="center"/>
+              <w:rPr>
+                <w:rFonts w:ascii="Arial" w:hAnsi="Arial" w:cs="Arial"/>
+              </w:rPr>
+            </w:pPr>
+            <w:r>
+              <w:rPr>
+                <w:rFonts w:ascii="Arial" w:hAnsi="Arial" w:cs="Arial"/>
+              </w:rPr>
+              <w:t/>
+            </w:r>
+          </w:p>
+        </w:tc>
+      </w:tr>
+      <w:tr>
+        <w:trPr>
+          <w:trHeight w:hRule="exact" w:val="510"/>
+        </w:trPr>
+        <w:tc>
+          <w:tcPr>
+            <w:tcW w:w="903" w:type="pct"/>
+            <w:vAlign w:val="center"/>
+          </w:tcPr>
+          <w:p>
+            <w:pPr>
+              <w:jc w:val="center"/>
+              <w:rPr>
+                <w:rFonts w:ascii="Arial" w:hAnsi="Arial" w:cs="Arial"/>
+              </w:rPr>
+            </w:pPr>
+            <w:r>
+              <w:rPr>
+                <w:rFonts w:ascii="Arial" w:hAnsi="Arial" w:cs="Arial"/>
+              </w:rPr>
+              <w:t xml:space="preserve">CP-TZ-API-DEV-MTAVG53N-NNZG-26012</w:t>
+            </w:r>
+          </w:p>
+        </w:tc>
+        <w:tc>
+          <w:tcPr>
+            <w:tcW w:w="1393" w:type="pct"/>
+            <w:vAlign w:val="center"/>
+          </w:tcPr>
+          <w:p>
+            <w:pPr>
+              <w:rPr>
+                <w:rFonts w:ascii="Arial" w:hAnsi="Arial" w:cs="Arial"/>
+              </w:rPr>
+            </w:pPr>
+            <w:r>
+              <w:rPr>
+                <w:rFonts w:ascii="Arial" w:hAnsi="Arial" w:cs="Arial"/>
+              </w:rPr>
+              <w:t xml:space="preserve">优化生产车间的温湿度控制，确保环境条件符合生产要求。预期完成日期 2026.09.20</w:t>
+            </w:r>
+          </w:p>
+        </w:tc>
+        <w:tc>
+          <w:tcPr>
+            <w:tcW w:w="573" w:type="pct"/>
+            <w:vAlign w:val="center"/>
+          </w:tcPr>
+          <w:p>
+            <w:pPr>
+              <w:rPr>
+                <w:rFonts w:ascii="Arial" w:hAnsi="Arial" w:cs="Arial"/>
+              </w:rPr>
+            </w:pPr>
+            <w:r>
+              <w:rPr>
+                <w:rFonts w:ascii="Arial" w:hAnsi="Arial" w:cs="Arial"/>
+              </w:rPr>
+              <w:t xml:space="preserve">环境控制部孙工</w:t>
+            </w:r>
+          </w:p>
+        </w:tc>
+        <w:tc>
+          <w:tcPr>
+            <w:tcW w:w="1034" w:type="pct"/>
+            <w:vAlign w:val="center"/>
+          </w:tcPr>
+          <w:p>
+            <w:pPr>
+              <w:jc w:val="center"/>
+              <w:rPr>
+                <w:rFonts w:ascii="Arial" w:hAnsi="Arial" w:cs="Arial"/>
+              </w:rPr>
+            </w:pPr>
+            <w:r>
+              <w:rPr>
+                <w:rFonts w:ascii="Arial" w:hAnsi="Arial" w:cs="Arial"/>
+              </w:rPr>
+              <w:t xml:space="preserve">2026.09.20</w:t>
+            </w:r>
+          </w:p>
+        </w:tc>
+        <w:tc>
+          <w:tcPr>
+            <w:tcW w:w="1097" w:type="pct"/>
+            <w:vAlign w:val="center"/>
+          </w:tcPr>
+          <w:p>
+            <w:pPr>
+              <w:jc w:val="center"/>
+              <w:rPr>
+                <w:rFonts w:ascii="Arial" w:hAnsi="Arial" w:cs="Arial"/>
+              </w:rPr>
+            </w:pPr>
+            <w:r>
+              <w:rPr>
+                <w:rFonts w:ascii="Arial" w:hAnsi="Arial" w:cs="Arial"/>
+              </w:rPr>
+              <w:t/>
+            </w:r>
+          </w:p>
+        </w:tc>
+      </w:tr>
+      <w:tr>
+        <w:trPr>
+          <w:trHeight w:hRule="exact" w:val="510"/>
+        </w:trPr>
+        <w:tc>
+          <w:tcPr>
+            <w:tcW w:w="903" w:type="pct"/>
+            <w:vAlign w:val="center"/>
+          </w:tcPr>
+          <w:p>
+            <w:pPr>
+              <w:jc w:val="center"/>
+              <w:rPr>
+                <w:rFonts w:ascii="Arial" w:hAnsi="Arial" w:cs="Arial"/>
+              </w:rPr>
+            </w:pPr>
+            <w:r>
+              <w:rPr>
+                <w:rFonts w:ascii="Arial" w:hAnsi="Arial" w:cs="Arial"/>
+              </w:rPr>
+              <w:t xml:space="preserve">CP-TZ-API-DEV-MTAVG53N-NNZG-26013</w:t>
+            </w:r>
+          </w:p>
+        </w:tc>
+        <w:tc>
+          <w:tcPr>
+            <w:tcW w:w="1393" w:type="pct"/>
+            <w:vAlign w:val="center"/>
+          </w:tcPr>
+          <w:p>
+            <w:pPr>
+              <w:rPr>
+                <w:rFonts w:ascii="Arial" w:hAnsi="Arial" w:cs="Arial"/>
+              </w:rPr>
+            </w:pPr>
+            <w:r>
+              <w:rPr>
+                <w:rFonts w:ascii="Arial" w:hAnsi="Arial" w:cs="Arial"/>
+              </w:rPr>
+              <w:t xml:space="preserve">提高生产车间的清洁度，确保生产环境无杂质。预期完成日期 2026.09.15</w:t>
+            </w:r>
+          </w:p>
+        </w:tc>
+        <w:tc>
+          <w:tcPr>
+            <w:tcW w:w="573" w:type="pct"/>
+            <w:vAlign w:val="center"/>
+          </w:tcPr>
+          <w:p>
+            <w:pPr>
+              <w:rPr>
+                <w:rFonts w:ascii="Arial" w:hAnsi="Arial" w:cs="Arial"/>
+              </w:rPr>
+            </w:pPr>
+            <w:r>
+              <w:rPr>
+                <w:rFonts w:ascii="Arial" w:hAnsi="Arial" w:cs="Arial"/>
+              </w:rPr>
+              <w:t xml:space="preserve">清洁维护部周工</w:t>
+            </w:r>
+          </w:p>
+        </w:tc>
+        <w:tc>
+          <w:tcPr>
+            <w:tcW w:w="1034" w:type="pct"/>
+            <w:vAlign w:val="center"/>
+          </w:tcPr>
+          <w:p>
+            <w:pPr>
+              <w:jc w:val="center"/>
+              <w:rPr>
+                <w:rFonts w:ascii="Arial" w:hAnsi="Arial" w:cs="Arial"/>
+              </w:rPr>
+            </w:pPr>
+            <w:r>
+              <w:rPr>
+                <w:rFonts w:ascii="Arial" w:hAnsi="Arial" w:cs="Arial"/>
+              </w:rPr>
+              <w:t xml:space="preserve">2026.09.15</w:t>
+            </w:r>
+          </w:p>
+        </w:tc>
+        <w:tc>
+          <w:tcPr>
+            <w:tcW w:w="1097" w:type="pct"/>
+            <w:vAlign w:val="center"/>
+          </w:tcPr>
+          <w:p>
+            <w:pPr>
+              <w:jc w:val="center"/>
+              <w:rPr>
+                <w:rFonts w:ascii="Arial" w:hAnsi="Arial" w:cs="Arial"/>
+              </w:rPr>
+            </w:pPr>
+            <w:r>
+              <w:rPr>
+                <w:rFonts w:ascii="Arial" w:hAnsi="Arial" w:cs="Arial"/>
+              </w:rPr>
+              <w:t/>
+            </w:r>
+          </w:p>
+        </w:tc>
+      </w:tr>
+      <w:tr>
+        <w:trPr>
+          <w:trHeight w:hRule="exact" w:val="510"/>
+        </w:trPr>
+        <w:tc>
+          <w:tcPr>
+            <w:tcW w:w="903" w:type="pct"/>
+            <w:vAlign w:val="center"/>
+          </w:tcPr>
+          <w:p>
+            <w:pPr>
+              <w:jc w:val="center"/>
+              <w:rPr>
+                <w:rFonts w:ascii="Arial" w:hAnsi="Arial" w:cs="Arial"/>
+              </w:rPr>
+            </w:pPr>
+            <w:r>
+              <w:rPr>
+                <w:rFonts w:ascii="Arial" w:hAnsi="Arial" w:cs="Arial"/>
+              </w:rPr>
+              <w:t xml:space="preserve">CP-TZ-API-DEV-MTAVG53N-NNZG-26014</w:t>
+            </w:r>
+          </w:p>
+        </w:tc>
+        <w:tc>
+          <w:tcPr>
+            <w:tcW w:w="1393" w:type="pct"/>
+            <w:vAlign w:val="center"/>
+          </w:tcPr>
+          <w:p>
+            <w:pPr>
+              <w:rPr>
+                <w:rFonts w:ascii="Arial" w:hAnsi="Arial" w:cs="Arial"/>
+              </w:rPr>
+            </w:pPr>
+            <w:r>
+              <w:rPr>
+                <w:rFonts w:ascii="Arial" w:hAnsi="Arial" w:cs="Arial"/>
+              </w:rPr>
+              <w:t xml:space="preserve">减少生产车间的振动和噪音，提高设备运行稳定性。预期完成日期 2026.09.20</w:t>
+            </w:r>
+          </w:p>
+        </w:tc>
+        <w:tc>
+          <w:tcPr>
+            <w:tcW w:w="573" w:type="pct"/>
+            <w:vAlign w:val="center"/>
+          </w:tcPr>
+          <w:p>
+            <w:pPr>
+              <w:rPr>
+                <w:rFonts w:ascii="Arial" w:hAnsi="Arial" w:cs="Arial"/>
+              </w:rPr>
+            </w:pPr>
+            <w:r>
+              <w:rPr>
+                <w:rFonts w:ascii="Arial" w:hAnsi="Arial" w:cs="Arial"/>
+              </w:rPr>
+              <w:t xml:space="preserve">设备维护部张工</w:t>
+            </w:r>
+          </w:p>
+        </w:tc>
+        <w:tc>
+          <w:tcPr>
+            <w:tcW w:w="1034" w:type="pct"/>
+            <w:vAlign w:val="center"/>
+          </w:tcPr>
+          <w:p>
+            <w:pPr>
+              <w:jc w:val="center"/>
+              <w:rPr>
+                <w:rFonts w:ascii="Arial" w:hAnsi="Arial" w:cs="Arial"/>
+              </w:rPr>
+            </w:pPr>
+            <w:r>
+              <w:rPr>
+                <w:rFonts w:ascii="Arial" w:hAnsi="Arial" w:cs="Arial"/>
+              </w:rPr>
+              <w:t xml:space="preserve">2026.09.20</w:t>
+            </w:r>
+          </w:p>
+        </w:tc>
+        <w:tc>
+          <w:tcPr>
+            <w:tcW w:w="1097" w:type="pct"/>
+            <w:vAlign w:val="center"/>
+          </w:tcPr>
+          <w:p>
+            <w:pPr>
+              <w:jc w:val="center"/>
+              <w:rPr>
+                <w:rFonts w:ascii="Arial" w:hAnsi="Arial" w:cs="Arial"/>
+              </w:rPr>
+            </w:pPr>
+            <w:r>
+              <w:rPr>
+                <w:rFonts w:ascii="Arial" w:hAnsi="Arial" w:cs="Arial"/>
+              </w:rPr>
+              <w:t/>
+            </w:r>
+          </w:p>
+        </w:tc>
+      </w:tr>
+      <w:tr>
+        <w:trPr>
+          <w:trHeight w:hRule="exact" w:val="510"/>
+        </w:trPr>
+        <w:tc>
+          <w:tcPr>
+            <w:tcW w:w="903" w:type="pct"/>
+            <w:vAlign w:val="center"/>
+          </w:tcPr>
+          <w:p>
+            <w:pPr>
+              <w:jc w:val="center"/>
+              <w:rPr>
+                <w:rFonts w:ascii="Arial" w:hAnsi="Arial" w:cs="Arial"/>
+              </w:rPr>
+            </w:pPr>
+            <w:r>
+              <w:rPr>
+                <w:rFonts w:ascii="Arial" w:hAnsi="Arial" w:cs="Arial"/>
+              </w:rPr>
+              <w:t xml:space="preserve">CP-TZ-API-DEV-MTAVG53N-NNZG-26015</w:t>
+            </w:r>
+          </w:p>
+        </w:tc>
+        <w:tc>
+          <w:tcPr>
+            <w:tcW w:w="1393" w:type="pct"/>
+            <w:vAlign w:val="center"/>
+          </w:tcPr>
+          <w:p>
+            <w:pPr>
+              <w:rPr>
+                <w:rFonts w:ascii="Arial" w:hAnsi="Arial" w:cs="Arial"/>
+              </w:rPr>
+            </w:pPr>
+            <w:r>
+              <w:rPr>
+                <w:rFonts w:ascii="Arial" w:hAnsi="Arial" w:cs="Arial"/>
+              </w:rPr>
+              <w:t xml:space="preserve">优化生产车间的气流控制，确保物料均匀分布。预期完成日期 2026.09.20</w:t>
+            </w:r>
+          </w:p>
+        </w:tc>
+        <w:tc>
+          <w:tcPr>
+            <w:tcW w:w="573" w:type="pct"/>
+            <w:vAlign w:val="center"/>
+          </w:tcPr>
+          <w:p>
+            <w:pPr>
+              <w:rPr>
+                <w:rFonts w:ascii="Arial" w:hAnsi="Arial" w:cs="Arial"/>
+              </w:rPr>
+            </w:pPr>
+            <w:r>
+              <w:rPr>
+                <w:rFonts w:ascii="Arial" w:hAnsi="Arial" w:cs="Arial"/>
+              </w:rPr>
+              <w:t xml:space="preserve">环境控制部孙工</w:t>
+            </w:r>
+          </w:p>
+        </w:tc>
+        <w:tc>
+          <w:tcPr>
+            <w:tcW w:w="1034" w:type="pct"/>
+            <w:vAlign w:val="center"/>
+          </w:tcPr>
+          <w:p>
+            <w:pPr>
+              <w:jc w:val="center"/>
+              <w:rPr>
+                <w:rFonts w:ascii="Arial" w:hAnsi="Arial" w:cs="Arial"/>
+              </w:rPr>
+            </w:pPr>
+            <w:r>
+              <w:rPr>
+                <w:rFonts w:ascii="Arial" w:hAnsi="Arial" w:cs="Arial"/>
+              </w:rPr>
+              <w:t xml:space="preserve">2026.09.20</w:t>
+            </w:r>
+          </w:p>
+        </w:tc>
+        <w:tc>
+          <w:tcPr>
+            <w:tcW w:w="1097" w:type="pct"/>
+            <w:vAlign w:val="center"/>
+          </w:tcPr>
+          <w:p>
+            <w:pPr>
+              <w:jc w:val="center"/>
+              <w:rPr>
+                <w:rFonts w:ascii="Arial" w:hAnsi="Arial" w:cs="Arial"/>
+              </w:rPr>
+            </w:pPr>
+            <w:r>
+              <w:rPr>
+                <w:rFonts w:ascii="Arial" w:hAnsi="Arial" w:cs="Arial"/>
+              </w:rPr>
+              <w:t/>
+            </w:r>
+          </w:p>
+        </w:tc>
+      </w:tr>
+      <w:tr>
+        <w:trPr>
+          <w:trHeight w:hRule="exact" w:val="510"/>
+        </w:trPr>
+        <w:tc>
+          <w:tcPr>
+            <w:tcW w:w="903" w:type="pct"/>
+            <w:vAlign w:val="center"/>
+          </w:tcPr>
+          <w:p>
+            <w:pPr>
+              <w:jc w:val="center"/>
+              <w:rPr>
+                <w:rFonts w:ascii="Arial" w:hAnsi="Arial" w:cs="Arial"/>
+              </w:rPr>
+            </w:pPr>
+            <w:r>
+              <w:rPr>
+                <w:rFonts w:ascii="Arial" w:hAnsi="Arial" w:cs="Arial"/>
+              </w:rPr>
+              <w:t xml:space="preserve">CP-TZ-API-DEV-MTAVG53N-NNZG-26016</w:t>
+            </w:r>
+          </w:p>
+        </w:tc>
+        <w:tc>
+          <w:tcPr>
+            <w:tcW w:w="1393" w:type="pct"/>
+            <w:vAlign w:val="center"/>
+          </w:tcPr>
+          <w:p>
+            <w:pPr>
+              <w:rPr>
+                <w:rFonts w:ascii="Arial" w:hAnsi="Arial" w:cs="Arial"/>
+              </w:rPr>
+            </w:pPr>
+            <w:r>
+              <w:rPr>
+                <w:rFonts w:ascii="Arial" w:hAnsi="Arial" w:cs="Arial"/>
+              </w:rPr>
+              <w:t xml:space="preserve">完成H0-TM-23114《片重检测设备操作规程》的升版，增加对设备校准状态的检查要求，经审核批准后下发执行。预期完成日期 2026.09.15</w:t>
+            </w:r>
+          </w:p>
+        </w:tc>
+        <w:tc>
+          <w:tcPr>
+            <w:tcW w:w="573" w:type="pct"/>
+            <w:vAlign w:val="center"/>
+          </w:tcPr>
+          <w:p>
+            <w:pPr>
+              <w:rPr>
+                <w:rFonts w:ascii="Arial" w:hAnsi="Arial" w:cs="Arial"/>
+              </w:rPr>
+            </w:pPr>
+            <w:r>
+              <w:rPr>
+                <w:rFonts w:ascii="Arial" w:hAnsi="Arial" w:cs="Arial"/>
+              </w:rPr>
+              <w:t xml:space="preserve">质量控制部李工</w:t>
+            </w:r>
+          </w:p>
+        </w:tc>
+        <w:tc>
+          <w:tcPr>
+            <w:tcW w:w="1034" w:type="pct"/>
+            <w:vAlign w:val="center"/>
+          </w:tcPr>
+          <w:p>
+            <w:pPr>
+              <w:jc w:val="center"/>
+              <w:rPr>
+                <w:rFonts w:ascii="Arial" w:hAnsi="Arial" w:cs="Arial"/>
+              </w:rPr>
+            </w:pPr>
+            <w:r>
+              <w:rPr>
+                <w:rFonts w:ascii="Arial" w:hAnsi="Arial" w:cs="Arial"/>
+              </w:rPr>
+              <w:t xml:space="preserve">2026.09.15</w:t>
+            </w:r>
+          </w:p>
+        </w:tc>
+        <w:tc>
+          <w:tcPr>
+            <w:tcW w:w="1097" w:type="pct"/>
+            <w:vAlign w:val="center"/>
+          </w:tcPr>
+          <w:p>
+            <w:pPr>
+              <w:jc w:val="center"/>
+              <w:rPr>
+                <w:rFonts w:ascii="Arial" w:hAnsi="Arial" w:cs="Arial"/>
+              </w:rPr>
+            </w:pPr>
+            <w:r>
+              <w:rPr>
+                <w:rFonts w:ascii="Arial" w:hAnsi="Arial" w:cs="Arial"/>
+              </w:rPr>
+              <w:t/>
+            </w:r>
+          </w:p>
+        </w:tc>
+      </w:tr>
+      <w:tr>
+        <w:trPr>
+          <w:trHeight w:hRule="exact" w:val="510"/>
+        </w:trPr>
+        <w:tc>
+          <w:tcPr>
+            <w:tcW w:w="903" w:type="pct"/>
+            <w:vAlign w:val="center"/>
+          </w:tcPr>
+          <w:p>
+            <w:pPr>
+              <w:jc w:val="center"/>
+              <w:rPr>
+                <w:rFonts w:ascii="Arial" w:hAnsi="Arial" w:cs="Arial"/>
+              </w:rPr>
+            </w:pPr>
+            <w:r>
+              <w:rPr>
+                <w:rFonts w:ascii="Arial" w:hAnsi="Arial" w:cs="Arial"/>
+              </w:rPr>
+              <w:t xml:space="preserve">CP-TZ-API-DEV-MTAVG53N-NNZG-26017</w:t>
+            </w:r>
+          </w:p>
+        </w:tc>
+        <w:tc>
+          <w:tcPr>
+            <w:tcW w:w="1393" w:type="pct"/>
+            <w:vAlign w:val="center"/>
+          </w:tcPr>
+          <w:p>
+            <w:pPr>
+              <w:rPr>
+                <w:rFonts w:ascii="Arial" w:hAnsi="Arial" w:cs="Arial"/>
+              </w:rPr>
+            </w:pPr>
+            <w:r>
+              <w:rPr>
+                <w:rFonts w:ascii="Arial" w:hAnsi="Arial" w:cs="Arial"/>
+              </w:rPr>
+              <w:t xml:space="preserve">对操作员进行专项培训，提高其对设备异常的识别能力和报告意识，以及对物料粒度分布影响的认识。预期完成日期 2026.09.10</w:t>
+            </w:r>
+          </w:p>
+        </w:tc>
+        <w:tc>
+          <w:tcPr>
+            <w:tcW w:w="573" w:type="pct"/>
+            <w:vAlign w:val="center"/>
+          </w:tcPr>
+          <w:p>
+            <w:pPr>
+              <w:rPr>
+                <w:rFonts w:ascii="Arial" w:hAnsi="Arial" w:cs="Arial"/>
+              </w:rPr>
+            </w:pPr>
+            <w:r>
+              <w:rPr>
+                <w:rFonts w:ascii="Arial" w:hAnsi="Arial" w:cs="Arial"/>
+              </w:rPr>
+              <w:t xml:space="preserve">人力资源部吴经理</w:t>
+            </w:r>
+          </w:p>
+        </w:tc>
+        <w:tc>
+          <w:tcPr>
+            <w:tcW w:w="1034" w:type="pct"/>
+            <w:vAlign w:val="center"/>
+          </w:tcPr>
+          <w:p>
+            <w:pPr>
+              <w:jc w:val="center"/>
+              <w:rPr>
+                <w:rFonts w:ascii="Arial" w:hAnsi="Arial" w:cs="Arial"/>
+              </w:rPr>
+            </w:pPr>
+            <w:r>
+              <w:rPr>
+                <w:rFonts w:ascii="Arial" w:hAnsi="Arial" w:cs="Arial"/>
+              </w:rPr>
+              <w:t xml:space="preserve">2026.09.10</w:t>
             </w:r>
           </w:p>
         </w:tc>
@@ -4117,283 +4941,7 @@
                 <w:szCs w:val="21"/>
                 <w:lang w:eastAsia="zh-CN"/>
               </w:rPr>
-              <w:t xml:space="preserve">压片机的维护保养记录</w:t>
-            </w:r>
-          </w:p>
-        </w:tc>
-        <w:tc>
-          <w:tcPr>
-            <w:tcW w:w="1080" w:type="pct"/>
-            <w:vAlign w:val="center"/>
-          </w:tcPr>
-          <w:p>
-            <w:pPr>
-              <w:pStyle w:val="a0"/>
-              <w:spacing w:before="0" w:after="0" w:line="240" w:lineRule="auto"/>
-              <w:ind w:left="0"/>
-              <w:jc w:val="center"/>
-              <w:rPr>
-                <w:rFonts w:ascii="Arial" w:hAnsi="Arial" w:cs="Arial"/>
-                <w:sz w:val="21"/>
-                <w:szCs w:val="21"/>
-                <w:lang w:eastAsia="zh-CN"/>
-              </w:rPr>
-            </w:pPr>
-            <w:r>
-              <w:rPr>
-                <w:rFonts w:ascii="Arial" w:hAnsi="Arial" w:cs="Arial"/>
-                <w:sz w:val="21"/>
-                <w:szCs w:val="21"/>
-                <w:lang w:eastAsia="zh-CN"/>
-              </w:rPr>
-              <w:t xml:space="preserve">待补充</w:t>
-            </w:r>
-          </w:p>
-        </w:tc>
-      </w:tr>
-      <w:tr>
-        <w:trPr>
-          <w:trHeight w:hRule="exact" w:val="510"/>
-        </w:trPr>
-        <w:tc>
-          <w:tcPr>
-            <w:tcW w:w="1597" w:type="pct"/>
-            <w:vAlign w:val="center"/>
-          </w:tcPr>
-          <w:p>
-            <w:pPr>
-              <w:pStyle w:val="a0"/>
-              <w:spacing w:before="0" w:after="0" w:line="240" w:lineRule="auto"/>
-              <w:ind w:left="0"/>
-              <w:jc w:val="center"/>
-              <w:rPr>
-                <w:rFonts w:ascii="Arial" w:hAnsi="Arial" w:cs="Arial"/>
-                <w:sz w:val="21"/>
-                <w:szCs w:val="21"/>
-                <w:lang w:eastAsia="zh-CN"/>
-              </w:rPr>
-            </w:pPr>
-            <w:r>
-              <w:rPr>
-                <w:rFonts w:ascii="Arial" w:hAnsi="Arial" w:cs="Arial"/>
-                <w:sz w:val="21"/>
-                <w:szCs w:val="21"/>
-                <w:lang w:eastAsia="zh-CN"/>
-              </w:rPr>
-              <w:t xml:space="preserve">调查报告-附件2</w:t>
-            </w:r>
-          </w:p>
-        </w:tc>
-        <w:tc>
-          <w:tcPr>
-            <w:tcW w:w="2323" w:type="pct"/>
-            <w:vAlign w:val="center"/>
-          </w:tcPr>
-          <w:p>
-            <w:pPr>
-              <w:pStyle w:val="a0"/>
-              <w:spacing w:before="0" w:after="0" w:line="240" w:lineRule="auto"/>
-              <w:ind w:left="0"/>
-              <w:jc w:val="center"/>
-              <w:rPr>
-                <w:rFonts w:ascii="Arial" w:hAnsi="Arial" w:cs="Arial"/>
-                <w:sz w:val="21"/>
-                <w:szCs w:val="21"/>
-                <w:lang w:eastAsia="zh-CN"/>
-              </w:rPr>
-            </w:pPr>
-            <w:r>
-              <w:rPr>
-                <w:rFonts w:ascii="Arial" w:hAnsi="Arial" w:cs="Arial"/>
-                <w:sz w:val="21"/>
-                <w:szCs w:val="21"/>
-                <w:lang w:eastAsia="zh-CN"/>
-              </w:rPr>
-              <w:t xml:space="preserve">物料粒度分布检查报告</w:t>
-            </w:r>
-          </w:p>
-        </w:tc>
-        <w:tc>
-          <w:tcPr>
-            <w:tcW w:w="1080" w:type="pct"/>
-            <w:vAlign w:val="center"/>
-          </w:tcPr>
-          <w:p>
-            <w:pPr>
-              <w:pStyle w:val="a0"/>
-              <w:spacing w:before="0" w:after="0" w:line="240" w:lineRule="auto"/>
-              <w:ind w:left="0"/>
-              <w:jc w:val="center"/>
-              <w:rPr>
-                <w:rFonts w:ascii="Arial" w:hAnsi="Arial" w:cs="Arial"/>
-                <w:sz w:val="21"/>
-                <w:szCs w:val="21"/>
-                <w:lang w:eastAsia="zh-CN"/>
-              </w:rPr>
-            </w:pPr>
-            <w:r>
-              <w:rPr>
-                <w:rFonts w:ascii="Arial" w:hAnsi="Arial" w:cs="Arial"/>
-                <w:sz w:val="21"/>
-                <w:szCs w:val="21"/>
-                <w:lang w:eastAsia="zh-CN"/>
-              </w:rPr>
-              <w:t xml:space="preserve">待补充</w:t>
-            </w:r>
-          </w:p>
-        </w:tc>
-      </w:tr>
-      <w:tr>
-        <w:trPr>
-          <w:trHeight w:hRule="exact" w:val="510"/>
-        </w:trPr>
-        <w:tc>
-          <w:tcPr>
-            <w:tcW w:w="1597" w:type="pct"/>
-            <w:vAlign w:val="center"/>
-          </w:tcPr>
-          <w:p>
-            <w:pPr>
-              <w:pStyle w:val="a0"/>
-              <w:spacing w:before="0" w:after="0" w:line="240" w:lineRule="auto"/>
-              <w:ind w:left="0"/>
-              <w:jc w:val="center"/>
-              <w:rPr>
-                <w:rFonts w:ascii="Arial" w:hAnsi="Arial" w:cs="Arial"/>
-                <w:sz w:val="21"/>
-                <w:szCs w:val="21"/>
-                <w:lang w:eastAsia="zh-CN"/>
-              </w:rPr>
-            </w:pPr>
-            <w:r>
-              <w:rPr>
-                <w:rFonts w:ascii="Arial" w:hAnsi="Arial" w:cs="Arial"/>
-                <w:sz w:val="21"/>
-                <w:szCs w:val="21"/>
-                <w:lang w:eastAsia="zh-CN"/>
-              </w:rPr>
-              <w:t xml:space="preserve">调查报告-附件3</w:t>
-            </w:r>
-          </w:p>
-        </w:tc>
-        <w:tc>
-          <w:tcPr>
-            <w:tcW w:w="2323" w:type="pct"/>
-            <w:vAlign w:val="center"/>
-          </w:tcPr>
-          <w:p>
-            <w:pPr>
-              <w:pStyle w:val="a0"/>
-              <w:spacing w:before="0" w:after="0" w:line="240" w:lineRule="auto"/>
-              <w:ind w:left="0"/>
-              <w:jc w:val="center"/>
-              <w:rPr>
-                <w:rFonts w:ascii="Arial" w:hAnsi="Arial" w:cs="Arial"/>
-                <w:sz w:val="21"/>
-                <w:szCs w:val="21"/>
-                <w:lang w:eastAsia="zh-CN"/>
-              </w:rPr>
-            </w:pPr>
-            <w:r>
-              <w:rPr>
-                <w:rFonts w:ascii="Arial" w:hAnsi="Arial" w:cs="Arial"/>
-                <w:sz w:val="21"/>
-                <w:szCs w:val="21"/>
-                <w:lang w:eastAsia="zh-CN"/>
-              </w:rPr>
-              <w:t xml:space="preserve">现行规程H0-TM-23113</w:t>
-            </w:r>
-          </w:p>
-        </w:tc>
-        <w:tc>
-          <w:tcPr>
-            <w:tcW w:w="1080" w:type="pct"/>
-            <w:vAlign w:val="center"/>
-          </w:tcPr>
-          <w:p>
-            <w:pPr>
-              <w:pStyle w:val="a0"/>
-              <w:spacing w:before="0" w:after="0" w:line="240" w:lineRule="auto"/>
-              <w:ind w:left="0"/>
-              <w:jc w:val="center"/>
-              <w:rPr>
-                <w:rFonts w:ascii="Arial" w:hAnsi="Arial" w:cs="Arial"/>
-                <w:sz w:val="21"/>
-                <w:szCs w:val="21"/>
-                <w:lang w:eastAsia="zh-CN"/>
-              </w:rPr>
-            </w:pPr>
-            <w:r>
-              <w:rPr>
-                <w:rFonts w:ascii="Arial" w:hAnsi="Arial" w:cs="Arial"/>
-                <w:sz w:val="21"/>
-                <w:szCs w:val="21"/>
-                <w:lang w:eastAsia="zh-CN"/>
-              </w:rPr>
-              <w:t xml:space="preserve">待补充</w:t>
-            </w:r>
-          </w:p>
-        </w:tc>
-      </w:tr>
-      <w:tr>
-        <w:trPr>
-          <w:trHeight w:hRule="exact" w:val="510"/>
-        </w:trPr>
-        <w:tc>
-          <w:tcPr>
-            <w:tcW w:w="1597" w:type="pct"/>
-            <w:vAlign w:val="center"/>
-          </w:tcPr>
-          <w:p>
-            <w:pPr>
-              <w:pStyle w:val="a0"/>
-              <w:spacing w:before="0" w:after="0" w:line="240" w:lineRule="auto"/>
-              <w:ind w:left="0"/>
-              <w:jc w:val="center"/>
-              <w:rPr>
-                <w:rFonts w:ascii="Arial" w:hAnsi="Arial" w:cs="Arial"/>
-                <w:sz w:val="21"/>
-                <w:szCs w:val="21"/>
-                <w:lang w:eastAsia="zh-CN"/>
-              </w:rPr>
-            </w:pPr>
-            <w:r>
-              <w:rPr>
-                <w:rFonts w:ascii="Arial" w:hAnsi="Arial" w:cs="Arial"/>
-                <w:sz w:val="21"/>
-                <w:szCs w:val="21"/>
-                <w:lang w:eastAsia="zh-CN"/>
-              </w:rPr>
-              <w:t xml:space="preserve">调查报告-附件4</w:t>
-            </w:r>
-          </w:p>
-        </w:tc>
-        <w:tc>
-          <w:tcPr>
-            <w:tcW w:w="2323" w:type="pct"/>
-            <w:vAlign w:val="center"/>
-          </w:tcPr>
-          <w:p>
-            <w:pPr>
-              <w:pStyle w:val="a0"/>
-              <w:spacing w:before="0" w:after="0" w:line="240" w:lineRule="auto"/>
-              <w:ind w:left="0"/>
-              <w:jc w:val="center"/>
-              <w:rPr>
-                <w:rFonts w:ascii="Arial" w:hAnsi="Arial" w:cs="Arial"/>
-                <w:sz w:val="21"/>
-                <w:szCs w:val="21"/>
-                <w:lang w:eastAsia="zh-CN"/>
-              </w:rPr>
-            </w:pPr>
-            <w:r>
-              <w:rPr>
-                <w:rFonts w:ascii="Arial" w:hAnsi="Arial" w:cs="Arial"/>
-                <w:sz w:val="21"/>
-                <w:szCs w:val="21"/>
-                <w:lang w:eastAsia="zh-CN"/>
-              </w:rPr>
-              <w:t xml:space="preserve">片重测量设备的校准记录</w:t>
+              <w:t xml:space="preserve">校准/校验报告（如探头校准报告、仪表校验报告）</w:t>
             </w:r>
           </w:p>
         </w:tc>
@@ -4864,7 +5412,7 @@
               <w:rFonts w:ascii="宋体" w:hAnsi="宋体" w:cs="Arial"/>
               <w:bCs/>
             </w:rPr>
-            <w:t xml:space="preserve">文件编号：DEV-MT9LWHEN-MYD3-R</w:t>
+            <w:t xml:space="preserve">文件编号：DEV-MTAVG53N-NNZG-R</w:t>
           </w:r>
         </w:p>
       </w:tc>

</xml_diff>